<commit_message>
landing: add terms and privacy links to footer
</commit_message>
<xml_diff>
--- a/notes.docx
+++ b/notes.docx
@@ -129,6 +129,527 @@
       </w:r>
     </w:p>
     <w:p/>
+    <w:p>
+      <w:pPr>
+        <w:rPr>
+          <w:b/>
+          <w:bCs/>
+        </w:rPr>
+      </w:pPr>
+      <w:r>
+        <w:rPr>
+          <w:b/>
+          <w:bCs/>
+        </w:rPr>
+        <w:t>#GitHub Repository:</w:t>
+      </w:r>
+    </w:p>
+    <w:p>
+      <w:r>
+        <w:t>#Go to Git Hub and create a new repository with name of ‘</w:t>
+      </w:r>
+      <w:proofErr w:type="spellStart"/>
+      <w:r>
+        <w:t>spendly</w:t>
+      </w:r>
+      <w:proofErr w:type="spellEnd"/>
+      <w:r>
+        <w:t>’</w:t>
+      </w:r>
+    </w:p>
+    <w:p>
+      <w:r>
+        <w:t xml:space="preserve">#Copy the </w:t>
+      </w:r>
+      <w:proofErr w:type="spellStart"/>
+      <w:r>
+        <w:t>Url</w:t>
+      </w:r>
+      <w:proofErr w:type="spellEnd"/>
+      <w:r>
+        <w:t xml:space="preserve"> given after creation page -&gt; </w:t>
+      </w:r>
+      <w:hyperlink r:id="rId5" w:history="1">
+        <w:r>
+          <w:rPr>
+            <w:rStyle w:val="Hyperlink"/>
+          </w:rPr>
+          <w:t>https://github.com/daisyfaisal-cloud/spendly.git</w:t>
+        </w:r>
+      </w:hyperlink>
+    </w:p>
+    <w:p>
+      <w:proofErr w:type="gramStart"/>
+      <w:r>
+        <w:t>!</w:t>
+      </w:r>
+      <w:r>
+        <w:t>git</w:t>
+      </w:r>
+      <w:proofErr w:type="gramEnd"/>
+      <w:r>
+        <w:t xml:space="preserve"> config --global user.name "Faisal"</w:t>
+      </w:r>
+    </w:p>
+    <w:p>
+      <w:r>
+        <w:t>!</w:t>
+      </w:r>
+      <w:r>
+        <w:t xml:space="preserve"> git config --global </w:t>
+      </w:r>
+      <w:proofErr w:type="spellStart"/>
+      <w:proofErr w:type="gramStart"/>
+      <w:r>
+        <w:t>user.email</w:t>
+      </w:r>
+      <w:proofErr w:type="spellEnd"/>
+      <w:proofErr w:type="gramEnd"/>
+      <w:r>
+        <w:t xml:space="preserve"> </w:t>
+      </w:r>
+      <w:hyperlink r:id="rId6" w:history="1">
+        <w:r>
+          <w:rPr>
+            <w:rStyle w:val="Hyperlink"/>
+          </w:rPr>
+          <w:t>daisy.faisal@gmail.com</w:t>
+        </w:r>
+      </w:hyperlink>
+    </w:p>
+    <w:p>
+      <w:r>
+        <w:t># double check your user</w:t>
+      </w:r>
+    </w:p>
+    <w:p>
+      <w:proofErr w:type="gramStart"/>
+      <w:r>
+        <w:t>!</w:t>
+      </w:r>
+      <w:r>
+        <w:t>git</w:t>
+      </w:r>
+      <w:proofErr w:type="gramEnd"/>
+      <w:r>
+        <w:t xml:space="preserve"> config --global --list</w:t>
+      </w:r>
+    </w:p>
+    <w:p>
+      <w:pPr>
+        <w:rPr>
+          <w:b/>
+          <w:bCs/>
+          <w:u w:val="single"/>
+        </w:rPr>
+      </w:pPr>
+      <w:r>
+        <w:rPr>
+          <w:b/>
+          <w:bCs/>
+          <w:u w:val="single"/>
+        </w:rPr>
+        <w:t xml:space="preserve"># Need to authorize using web browser to connect </w:t>
+      </w:r>
+      <w:proofErr w:type="spellStart"/>
+      <w:r>
+        <w:rPr>
+          <w:b/>
+          <w:bCs/>
+          <w:u w:val="single"/>
+        </w:rPr>
+        <w:t>github</w:t>
+      </w:r>
+      <w:proofErr w:type="spellEnd"/>
+      <w:r>
+        <w:rPr>
+          <w:b/>
+          <w:bCs/>
+          <w:u w:val="single"/>
+        </w:rPr>
+        <w:t xml:space="preserve"> with your system</w:t>
+      </w:r>
+    </w:p>
+    <w:p>
+      <w:proofErr w:type="gramStart"/>
+      <w:r>
+        <w:t>!git</w:t>
+      </w:r>
+      <w:proofErr w:type="gramEnd"/>
+      <w:r>
+        <w:t xml:space="preserve"> </w:t>
+      </w:r>
+      <w:proofErr w:type="spellStart"/>
+      <w:r>
+        <w:t>init</w:t>
+      </w:r>
+      <w:proofErr w:type="spellEnd"/>
+    </w:p>
+    <w:p>
+      <w:proofErr w:type="gramStart"/>
+      <w:r>
+        <w:t>!git</w:t>
+      </w:r>
+      <w:proofErr w:type="gramEnd"/>
+      <w:r>
+        <w:t xml:space="preserve"> commit -m “initial commit’</w:t>
+      </w:r>
+    </w:p>
+    <w:p>
+      <w:proofErr w:type="gramStart"/>
+      <w:r>
+        <w:t>!git</w:t>
+      </w:r>
+      <w:proofErr w:type="gramEnd"/>
+      <w:r>
+        <w:t xml:space="preserve"> remote add origin </w:t>
+      </w:r>
+      <w:hyperlink r:id="rId7" w:history="1">
+        <w:r>
+          <w:rPr>
+            <w:rStyle w:val="Hyperlink"/>
+          </w:rPr>
+          <w:t>https://github.com/daisyfaisal-cloud/spendly.git</w:t>
+        </w:r>
+      </w:hyperlink>
+    </w:p>
+    <w:p>
+      <w:proofErr w:type="gramStart"/>
+      <w:r>
+        <w:t>!</w:t>
+      </w:r>
+      <w:r>
+        <w:t>git</w:t>
+      </w:r>
+      <w:proofErr w:type="gramEnd"/>
+      <w:r>
+        <w:t xml:space="preserve"> push -u origin main</w:t>
+      </w:r>
+    </w:p>
+    <w:p/>
+    <w:p>
+      <w:r>
+        <w:t># Ask questions from Claude Code about the project. Basic questions are as under:</w:t>
+      </w:r>
+    </w:p>
+    <w:p>
+      <w:r>
+        <w:t>W</w:t>
+      </w:r>
+      <w:r>
+        <w:t>hat does this project do?</w:t>
+      </w:r>
+    </w:p>
+    <w:p>
+      <w:r>
+        <w:t>W</w:t>
+      </w:r>
+      <w:r>
+        <w:t>hat tech stack does this project use?</w:t>
+      </w:r>
+    </w:p>
+    <w:p>
+      <w:r>
+        <w:t>Explain the project structure to me.</w:t>
+      </w:r>
+    </w:p>
+    <w:p/>
+    <w:p>
+      <w:r>
+        <w:t xml:space="preserve"># for local run of </w:t>
+      </w:r>
+      <w:proofErr w:type="spellStart"/>
+      <w:r>
+        <w:t>claude</w:t>
+      </w:r>
+      <w:proofErr w:type="spellEnd"/>
+      <w:r>
+        <w:t xml:space="preserve"> code on </w:t>
+      </w:r>
+      <w:proofErr w:type="spellStart"/>
+      <w:r>
+        <w:t>ollama</w:t>
+      </w:r>
+      <w:proofErr w:type="spellEnd"/>
+      <w:r>
+        <w:t xml:space="preserve"> local machine:</w:t>
+      </w:r>
+    </w:p>
+    <w:p>
+      <w:proofErr w:type="spellStart"/>
+      <w:r>
+        <w:rPr>
+          <w:highlight w:val="yellow"/>
+        </w:rPr>
+        <w:t>ollama</w:t>
+      </w:r>
+      <w:proofErr w:type="spellEnd"/>
+      <w:r>
+        <w:rPr>
+          <w:highlight w:val="yellow"/>
+        </w:rPr>
+        <w:t xml:space="preserve"> launch </w:t>
+      </w:r>
+      <w:proofErr w:type="spellStart"/>
+      <w:r>
+        <w:rPr>
+          <w:highlight w:val="yellow"/>
+        </w:rPr>
+        <w:t>claude</w:t>
+      </w:r>
+      <w:proofErr w:type="spellEnd"/>
+      <w:r>
+        <w:rPr>
+          <w:highlight w:val="yellow"/>
+        </w:rPr>
+        <w:t xml:space="preserve"> --model qwen2.5-coder:3b</w:t>
+      </w:r>
+    </w:p>
+    <w:p/>
+    <w:p>
+      <w:pPr>
+        <w:rPr>
+          <w:b/>
+          <w:bCs/>
+          <w:lang w:val="en-PK"/>
+        </w:rPr>
+      </w:pPr>
+      <w:r>
+        <w:rPr>
+          <w:rFonts w:ascii="Segoe UI Symbol" w:hAnsi="Segoe UI Symbol" w:cs="Segoe UI Symbol"/>
+          <w:b/>
+          <w:bCs/>
+          <w:lang w:val="en-PK"/>
+        </w:rPr>
+        <w:t>⚠</w:t>
+      </w:r>
+      <w:r>
+        <w:rPr>
+          <w:b/>
+          <w:bCs/>
+          <w:lang w:val="en-PK"/>
+        </w:rPr>
+        <w:t>️ Crucial Performance Tip</w:t>
+      </w:r>
+    </w:p>
+    <w:p>
+      <w:pPr>
+        <w:rPr>
+          <w:lang w:val="en-PK"/>
+        </w:rPr>
+      </w:pPr>
+      <w:r>
+        <w:rPr>
+          <w:lang w:val="en-PK"/>
+        </w:rPr>
+        <w:t xml:space="preserve">Because you are running on 16GB of RAM with an i7 (CPU-heavy), the default context window in </w:t>
+      </w:r>
+      <w:proofErr w:type="spellStart"/>
+      <w:r>
+        <w:rPr>
+          <w:lang w:val="en-PK"/>
+        </w:rPr>
+        <w:t>Ollama</w:t>
+      </w:r>
+      <w:proofErr w:type="spellEnd"/>
+      <w:r>
+        <w:rPr>
+          <w:lang w:val="en-PK"/>
+        </w:rPr>
+        <w:t xml:space="preserve"> might be too small for complex coding projects, or too large for your RAM to handle quickly.</w:t>
+      </w:r>
+      <w:r>
+        <w:rPr>
+          <w:lang w:val="en-PK"/>
+        </w:rPr>
+        <w:t xml:space="preserve"> </w:t>
+      </w:r>
+      <w:r>
+        <w:rPr>
+          <w:lang w:val="en-PK"/>
+        </w:rPr>
+        <w:t>If Claude Code feels slow or "forgets" things, you can create a custom version of the model with a fixed context window (e.g., 16k tokens) to keep things snappy:</w:t>
+      </w:r>
+    </w:p>
+    <w:p>
+      <w:pPr>
+        <w:numPr>
+          <w:ilvl w:val="0"/>
+          <w:numId w:val="1"/>
+        </w:numPr>
+        <w:rPr>
+          <w:lang w:val="en-PK"/>
+        </w:rPr>
+      </w:pPr>
+      <w:r>
+        <w:rPr>
+          <w:lang w:val="en-PK"/>
+        </w:rPr>
+        <w:t xml:space="preserve">Run </w:t>
+      </w:r>
+      <w:proofErr w:type="spellStart"/>
+      <w:r>
+        <w:rPr>
+          <w:lang w:val="en-PK"/>
+        </w:rPr>
+        <w:t>ollama</w:t>
+      </w:r>
+      <w:proofErr w:type="spellEnd"/>
+      <w:r>
+        <w:rPr>
+          <w:lang w:val="en-PK"/>
+        </w:rPr>
+        <w:t xml:space="preserve"> run qwen2.5-coder:3b.</w:t>
+      </w:r>
+    </w:p>
+    <w:p>
+      <w:pPr>
+        <w:numPr>
+          <w:ilvl w:val="0"/>
+          <w:numId w:val="1"/>
+        </w:numPr>
+        <w:rPr>
+          <w:lang w:val="en-PK"/>
+        </w:rPr>
+      </w:pPr>
+      <w:r>
+        <w:rPr>
+          <w:lang w:val="en-PK"/>
+        </w:rPr>
+        <w:t xml:space="preserve">Inside the prompt, type: /set parameter </w:t>
+      </w:r>
+      <w:proofErr w:type="spellStart"/>
+      <w:r>
+        <w:rPr>
+          <w:lang w:val="en-PK"/>
+        </w:rPr>
+        <w:t>num_ctx</w:t>
+      </w:r>
+      <w:proofErr w:type="spellEnd"/>
+      <w:r>
+        <w:rPr>
+          <w:lang w:val="en-PK"/>
+        </w:rPr>
+        <w:t xml:space="preserve"> 16384.</w:t>
+      </w:r>
+    </w:p>
+    <w:p>
+      <w:pPr>
+        <w:numPr>
+          <w:ilvl w:val="0"/>
+          <w:numId w:val="1"/>
+        </w:numPr>
+        <w:rPr>
+          <w:lang w:val="en-PK"/>
+        </w:rPr>
+      </w:pPr>
+      <w:r>
+        <w:rPr>
+          <w:lang w:val="en-PK"/>
+        </w:rPr>
+        <w:t>Then type: /save qwen-claude-3b.</w:t>
+      </w:r>
+    </w:p>
+    <w:p>
+      <w:pPr>
+        <w:numPr>
+          <w:ilvl w:val="0"/>
+          <w:numId w:val="1"/>
+        </w:numPr>
+        <w:rPr>
+          <w:lang w:val="en-PK"/>
+        </w:rPr>
+      </w:pPr>
+      <w:r>
+        <w:rPr>
+          <w:lang w:val="en-PK"/>
+        </w:rPr>
+        <w:t>Exit with /bye.</w:t>
+      </w:r>
+    </w:p>
+    <w:p>
+      <w:pPr>
+        <w:numPr>
+          <w:ilvl w:val="0"/>
+          <w:numId w:val="1"/>
+        </w:numPr>
+        <w:rPr>
+          <w:lang w:val="en-PK"/>
+        </w:rPr>
+      </w:pPr>
+      <w:r>
+        <w:rPr>
+          <w:lang w:val="en-PK"/>
+        </w:rPr>
+        <w:t xml:space="preserve">Now use that specific model name: </w:t>
+      </w:r>
+      <w:proofErr w:type="spellStart"/>
+      <w:r>
+        <w:rPr>
+          <w:highlight w:val="yellow"/>
+          <w:lang w:val="en-PK"/>
+        </w:rPr>
+        <w:t>claude</w:t>
+      </w:r>
+      <w:proofErr w:type="spellEnd"/>
+      <w:r>
+        <w:rPr>
+          <w:highlight w:val="yellow"/>
+          <w:lang w:val="en-PK"/>
+        </w:rPr>
+        <w:t xml:space="preserve"> --model qwen-claude-3b</w:t>
+      </w:r>
+      <w:r>
+        <w:rPr>
+          <w:lang w:val="en-PK"/>
+        </w:rPr>
+        <w:t>.</w:t>
+      </w:r>
+    </w:p>
+    <w:p>
+      <w:pPr>
+        <w:rPr>
+          <w:b/>
+          <w:bCs/>
+          <w:lang w:val="en-PK"/>
+        </w:rPr>
+      </w:pPr>
+      <w:r>
+        <w:rPr>
+          <w:b/>
+          <w:bCs/>
+          <w:lang w:val="en-PK"/>
+        </w:rPr>
+        <w:t>How do I know if it's working?</w:t>
+      </w:r>
+    </w:p>
+    <w:p>
+      <w:pPr>
+        <w:rPr>
+          <w:lang w:val="en-PK"/>
+        </w:rPr>
+      </w:pPr>
+      <w:r>
+        <w:rPr>
+          <w:lang w:val="en-PK"/>
+        </w:rPr>
+        <w:t xml:space="preserve">Once Claude Code starts, look at the status bar or type /model inside the Claude session. It should show </w:t>
+      </w:r>
+      <w:r>
+        <w:rPr>
+          <w:b/>
+          <w:bCs/>
+          <w:lang w:val="en-PK"/>
+        </w:rPr>
+        <w:t>qwen2.5-coder:3b</w:t>
+      </w:r>
+      <w:r>
+        <w:rPr>
+          <w:lang w:val="en-PK"/>
+        </w:rPr>
+        <w:t xml:space="preserve"> as the active model. Since it's local, you won't be charged any API credits for the messages!</w:t>
+      </w:r>
+    </w:p>
     <w:p/>
     <w:sectPr>
       <w:pgSz w:w="11906" w:h="16838"/>
@@ -138,6 +659,127 @@
     </w:sectPr>
   </w:body>
 </w:document>
+</file>
+
+<file path=word/numbering.xml><?xml version="1.0" encoding="utf-8"?>
+<w:numbering xmlns:wpc="http://schemas.microsoft.com/office/word/2010/wordprocessingCanvas" xmlns:cx="http://schemas.microsoft.com/office/drawing/2014/chartex" xmlns:cx1="http://schemas.microsoft.com/office/drawing/2015/9/8/chartex" xmlns:cx2="http://schemas.microsoft.com/office/drawing/2015/10/21/chartex" xmlns:cx3="http://schemas.microsoft.com/office/drawing/2016/5/9/chartex" xmlns:cx4="http://schemas.microsoft.com/office/drawing/2016/5/10/chartex" xmlns:cx5="http://schemas.microsoft.com/office/drawing/2016/5/11/chartex" xmlns:cx6="http://schemas.microsoft.com/office/drawing/2016/5/12/chartex" xmlns:cx7="http://schemas.microsoft.com/office/drawing/2016/5/13/chartex" xmlns:cx8="http://schemas.microsoft.com/office/drawing/2016/5/14/chartex" xmlns:mc="http://schemas.openxmlformats.org/markup-compatibility/2006" xmlns:aink="http://schemas.microsoft.com/office/drawing/2016/ink" xmlns:am3d="http://schemas.microsoft.com/office/drawing/2017/model3d" xmlns:o="urn:schemas-microsoft-com:office:office" xmlns:oel="http://schemas.microsoft.com/office/2019/extlst" xmlns:r="http://schemas.openxmlformats.org/officeDocument/2006/relationships" xmlns:m="http://schemas.openxmlformats.org/officeDocument/2006/math" xmlns:v="urn:schemas-microsoft-com:vml" xmlns:wp14="http://schemas.microsoft.com/office/word/2010/wordprocessingDrawing" xmlns:wp="http://schemas.openxmlformats.org/drawingml/2006/wordprocessingDrawing" xmlns:w10="urn:schemas-microsoft-com:office:word" xmlns:w="http://schemas.openxmlformats.org/wordprocessingml/2006/main" xmlns:w14="http://schemas.microsoft.com/office/word/2010/wordml" xmlns:w15="http://schemas.microsoft.com/office/word/2012/wordml" xmlns:w16cex="http://schemas.microsoft.com/office/word/2018/wordml/cex" xmlns:w16cid="http://schemas.microsoft.com/office/word/2016/wordml/cid" xmlns:w16="http://schemas.microsoft.com/office/word/2018/wordml" xmlns:w16sdtdh="http://schemas.microsoft.com/office/word/2020/wordml/sdtdatahash" xmlns:w16se="http://schemas.microsoft.com/office/word/2015/wordml/symex" xmlns:wpg="http://schemas.microsoft.com/office/word/2010/wordprocessingGroup" xmlns:wpi="http://schemas.microsoft.com/office/word/2010/wordprocessingInk" xmlns:wne="http://schemas.microsoft.com/office/word/2006/wordml" xmlns:wps="http://schemas.microsoft.com/office/word/2010/wordprocessingShape" mc:Ignorable="w14 w15 w16se w16cid w16 w16cex w16sdtdh wp14">
+  <w:abstractNum w:abstractNumId="0" w15:restartNumberingAfterBreak="0">
+    <w:nsid w:val="34097413"/>
+    <w:multiLevelType w:val="multilevel"/>
+    <w:tmpl w:val="94445D52"/>
+    <w:lvl w:ilvl="0">
+      <w:start w:val="1"/>
+      <w:numFmt w:val="decimal"/>
+      <w:lvlText w:val="%1."/>
+      <w:lvlJc w:val="left"/>
+      <w:pPr>
+        <w:tabs>
+          <w:tab w:val="num" w:pos="720"/>
+        </w:tabs>
+        <w:ind w:left="720" w:hanging="360"/>
+      </w:pPr>
+    </w:lvl>
+    <w:lvl w:ilvl="1" w:tentative="1">
+      <w:start w:val="1"/>
+      <w:numFmt w:val="decimal"/>
+      <w:lvlText w:val="%2."/>
+      <w:lvlJc w:val="left"/>
+      <w:pPr>
+        <w:tabs>
+          <w:tab w:val="num" w:pos="1440"/>
+        </w:tabs>
+        <w:ind w:left="1440" w:hanging="360"/>
+      </w:pPr>
+    </w:lvl>
+    <w:lvl w:ilvl="2" w:tentative="1">
+      <w:start w:val="1"/>
+      <w:numFmt w:val="decimal"/>
+      <w:lvlText w:val="%3."/>
+      <w:lvlJc w:val="left"/>
+      <w:pPr>
+        <w:tabs>
+          <w:tab w:val="num" w:pos="2160"/>
+        </w:tabs>
+        <w:ind w:left="2160" w:hanging="360"/>
+      </w:pPr>
+    </w:lvl>
+    <w:lvl w:ilvl="3" w:tentative="1">
+      <w:start w:val="1"/>
+      <w:numFmt w:val="decimal"/>
+      <w:lvlText w:val="%4."/>
+      <w:lvlJc w:val="left"/>
+      <w:pPr>
+        <w:tabs>
+          <w:tab w:val="num" w:pos="2880"/>
+        </w:tabs>
+        <w:ind w:left="2880" w:hanging="360"/>
+      </w:pPr>
+    </w:lvl>
+    <w:lvl w:ilvl="4" w:tentative="1">
+      <w:start w:val="1"/>
+      <w:numFmt w:val="decimal"/>
+      <w:lvlText w:val="%5."/>
+      <w:lvlJc w:val="left"/>
+      <w:pPr>
+        <w:tabs>
+          <w:tab w:val="num" w:pos="3600"/>
+        </w:tabs>
+        <w:ind w:left="3600" w:hanging="360"/>
+      </w:pPr>
+    </w:lvl>
+    <w:lvl w:ilvl="5" w:tentative="1">
+      <w:start w:val="1"/>
+      <w:numFmt w:val="decimal"/>
+      <w:lvlText w:val="%6."/>
+      <w:lvlJc w:val="left"/>
+      <w:pPr>
+        <w:tabs>
+          <w:tab w:val="num" w:pos="4320"/>
+        </w:tabs>
+        <w:ind w:left="4320" w:hanging="360"/>
+      </w:pPr>
+    </w:lvl>
+    <w:lvl w:ilvl="6" w:tentative="1">
+      <w:start w:val="1"/>
+      <w:numFmt w:val="decimal"/>
+      <w:lvlText w:val="%7."/>
+      <w:lvlJc w:val="left"/>
+      <w:pPr>
+        <w:tabs>
+          <w:tab w:val="num" w:pos="5040"/>
+        </w:tabs>
+        <w:ind w:left="5040" w:hanging="360"/>
+      </w:pPr>
+    </w:lvl>
+    <w:lvl w:ilvl="7" w:tentative="1">
+      <w:start w:val="1"/>
+      <w:numFmt w:val="decimal"/>
+      <w:lvlText w:val="%8."/>
+      <w:lvlJc w:val="left"/>
+      <w:pPr>
+        <w:tabs>
+          <w:tab w:val="num" w:pos="5760"/>
+        </w:tabs>
+        <w:ind w:left="5760" w:hanging="360"/>
+      </w:pPr>
+    </w:lvl>
+    <w:lvl w:ilvl="8" w:tentative="1">
+      <w:start w:val="1"/>
+      <w:numFmt w:val="decimal"/>
+      <w:lvlText w:val="%9."/>
+      <w:lvlJc w:val="left"/>
+      <w:pPr>
+        <w:tabs>
+          <w:tab w:val="num" w:pos="6480"/>
+        </w:tabs>
+        <w:ind w:left="6480" w:hanging="360"/>
+      </w:pPr>
+    </w:lvl>
+  </w:abstractNum>
+  <w:num w:numId="1" w16cid:durableId="911500187">
+    <w:abstractNumId w:val="0"/>
+  </w:num>
+</w:numbering>
 </file>
 
 <file path=word/styles.xml><?xml version="1.0" encoding="utf-8"?>
@@ -737,7 +1379,6 @@
   <w:style w:type="character" w:default="1" w:styleId="DefaultParagraphFont">
     <w:name w:val="Default Paragraph Font"/>
     <w:uiPriority w:val="1"/>
-    <w:semiHidden/>
     <w:unhideWhenUsed/>
   </w:style>
   <w:style w:type="table" w:default="1" w:styleId="TableNormal">
@@ -1050,6 +1691,29 @@
       <w:smallCaps/>
       <w:color w:val="0F4761" w:themeColor="accent1" w:themeShade="BF"/>
       <w:spacing w:val="5"/>
+    </w:rPr>
+  </w:style>
+  <w:style w:type="character" w:styleId="Hyperlink">
+    <w:name w:val="Hyperlink"/>
+    <w:basedOn w:val="DefaultParagraphFont"/>
+    <w:uiPriority w:val="99"/>
+    <w:unhideWhenUsed/>
+    <w:rsid w:val="00EB1549"/>
+    <w:rPr>
+      <w:color w:val="467886" w:themeColor="hyperlink"/>
+      <w:u w:val="single"/>
+    </w:rPr>
+  </w:style>
+  <w:style w:type="character" w:styleId="UnresolvedMention">
+    <w:name w:val="Unresolved Mention"/>
+    <w:basedOn w:val="DefaultParagraphFont"/>
+    <w:uiPriority w:val="99"/>
+    <w:semiHidden/>
+    <w:unhideWhenUsed/>
+    <w:rsid w:val="00EB1549"/>
+    <w:rPr>
+      <w:color w:val="605E5C"/>
+      <w:shd w:val="clear" w:color="auto" w:fill="E1DFDD"/>
     </w:rPr>
   </w:style>
 </w:styles>

</xml_diff>